<commit_message>
Fix mplfinance Chinese font rendering & update repo URL references
</commit_message>
<xml_diff>
--- a/Task1/Rebecca+Task1.docx
+++ b/Task1/Rebecca+Task1.docx
@@ -379,48 +379,36 @@
       <w:pPr>
         <w:spacing w:before="120" w:after="60"/>
         <w:jc w:val="left"/>
+        <w:rPr>
+          <w:lang w:eastAsia="zh-CN"/>
+        </w:rPr>
       </w:pPr>
+      <w:r>
+        <w:rPr>
+          <w:b/>
+          <w:sz w:val="28"/>
+          <w:lang w:eastAsia="zh-CN"/>
+        </w:rPr>
+        <w:t>任务三：</w:t>
+      </w:r>
       <w:proofErr w:type="spellStart"/>
       <w:r>
         <w:rPr>
           <w:b/>
           <w:sz w:val="28"/>
+          <w:lang w:eastAsia="zh-CN"/>
         </w:rPr>
-        <w:t>任务三：Tushare</w:t>
+        <w:t>Tushare</w:t>
       </w:r>
       <w:proofErr w:type="spellEnd"/>
       <w:r>
         <w:rPr>
           <w:b/>
           <w:sz w:val="28"/>
+          <w:lang w:eastAsia="zh-CN"/>
         </w:rPr>
-        <w:t xml:space="preserve"> Pro </w:t>
+        <w:t xml:space="preserve"> Pro 平台注册及 Python 数据获取实践</w:t>
       </w:r>
-      <w:proofErr w:type="spellStart"/>
-      <w:r>
-        <w:rPr>
-          <w:b/>
-          <w:sz w:val="28"/>
-        </w:rPr>
-        <w:t>平台注册及</w:t>
-      </w:r>
-      <w:proofErr w:type="spellEnd"/>
-      <w:r>
-        <w:rPr>
-          <w:b/>
-          <w:sz w:val="28"/>
-        </w:rPr>
-        <w:t xml:space="preserve"> Python </w:t>
-      </w:r>
-      <w:proofErr w:type="spellStart"/>
-      <w:r>
-        <w:rPr>
-          <w:b/>
-          <w:sz w:val="28"/>
-        </w:rPr>
-        <w:t>数据获取实践</w:t>
-      </w:r>
-      <w:proofErr w:type="spellEnd"/>
       <w:r>
         <w:rPr>
           <w:lang w:eastAsia="zh-CN"/>
@@ -874,294 +862,6 @@
     </w:p>
     <w:p>
       <w:pPr>
-        <w:spacing w:after="60" w:line="240" w:lineRule="auto"/>
-        <w:jc w:val="center"/>
-      </w:pPr>
-      <w:r>
-        <w:rPr>
-          <w:noProof/>
-        </w:rPr>
-        <w:drawing>
-          <wp:inline distT="0" distB="0" distL="0" distR="0" wp14:anchorId="4969D2F7" wp14:editId="7BCF2D1C">
-            <wp:extent cx="5029200" cy="3271713"/>
-            <wp:effectExtent l="0" t="0" r="0" b="0"/>
-            <wp:docPr id="2" name="Picture 2"/>
-            <wp:cNvGraphicFramePr>
-              <a:graphicFrameLocks xmlns:a="http://schemas.openxmlformats.org/drawingml/2006/main" noChangeAspect="1"/>
-            </wp:cNvGraphicFramePr>
-            <a:graphic xmlns:a="http://schemas.openxmlformats.org/drawingml/2006/main">
-              <a:graphicData uri="http://schemas.openxmlformats.org/drawingml/2006/picture">
-                <pic:pic xmlns:pic="http://schemas.openxmlformats.org/drawingml/2006/picture">
-                  <pic:nvPicPr>
-                    <pic:cNvPr id="0" name="300750_宁德时代_candle.png"/>
-                    <pic:cNvPicPr/>
-                  </pic:nvPicPr>
-                  <pic:blipFill>
-                    <a:blip r:embed="rId7"/>
-                    <a:stretch>
-                      <a:fillRect/>
-                    </a:stretch>
-                  </pic:blipFill>
-                  <pic:spPr>
-                    <a:xfrm>
-                      <a:off x="0" y="0"/>
-                      <a:ext cx="5029200" cy="3271713"/>
-                    </a:xfrm>
-                    <a:prstGeom prst="rect">
-                      <a:avLst/>
-                    </a:prstGeom>
-                  </pic:spPr>
-                </pic:pic>
-              </a:graphicData>
-            </a:graphic>
-          </wp:inline>
-        </w:drawing>
-      </w:r>
-    </w:p>
-    <w:p>
-      <w:pPr>
-        <w:spacing w:before="60" w:after="120"/>
-        <w:jc w:val="center"/>
-        <w:rPr>
-          <w:lang w:eastAsia="zh-CN"/>
-        </w:rPr>
-      </w:pPr>
-      <w:r>
-        <w:rPr>
-          <w:b/>
-          <w:sz w:val="18"/>
-          <w:lang w:eastAsia="zh-CN"/>
-        </w:rPr>
-        <w:t>图2：宁德时代（300750）日K线蜡烛图（</w:t>
-      </w:r>
-      <w:proofErr w:type="spellStart"/>
-      <w:r>
-        <w:rPr>
-          <w:b/>
-          <w:sz w:val="18"/>
-          <w:lang w:eastAsia="zh-CN"/>
-        </w:rPr>
-        <w:t>mplfinance</w:t>
-      </w:r>
-      <w:proofErr w:type="spellEnd"/>
-      <w:r>
-        <w:rPr>
-          <w:b/>
-          <w:sz w:val="18"/>
-          <w:lang w:eastAsia="zh-CN"/>
-        </w:rPr>
-        <w:t>绘制，红涨绿跌+成交量）</w:t>
-      </w:r>
-    </w:p>
-    <w:p>
-      <w:pPr>
-        <w:ind w:firstLine="420"/>
-        <w:rPr>
-          <w:lang w:eastAsia="zh-CN"/>
-        </w:rPr>
-      </w:pPr>
-      <w:r>
-        <w:t xml:space="preserve">图2使用 </w:t>
-      </w:r>
-      <w:proofErr w:type="spellStart"/>
-      <w:r>
-        <w:t>mplfinance</w:t>
-      </w:r>
-      <w:proofErr w:type="spellEnd"/>
-      <w:r>
-        <w:t xml:space="preserve"> 库绘制了宁德时代（300750）的标准K线蜡烛图（Candlestick Chart），</w:t>
-      </w:r>
-      <w:proofErr w:type="spellStart"/>
-      <w:r>
-        <w:t>与简单的折线图相比，每根K线完整呈现了开盘价、收盘价、最高价和最低价四维价格信息</w:t>
-      </w:r>
-      <w:proofErr w:type="spellEnd"/>
-      <w:r>
-        <w:t>。</w:t>
-      </w:r>
-      <w:r>
-        <w:rPr>
-          <w:lang w:eastAsia="zh-CN"/>
-        </w:rPr>
-        <w:t>红色实体表示当日上涨（收盘价高于开盘价），绿色实体表示当日下跌——实体越大说明当日涨跌幅度越强；实体上的细线（影线）越长则表明日内波动越剧烈。下方成交量柱状图使用对应颜色标注涨跌日的成交规模，量价配合分析可以揭示价格变动的可靠性。图表还叠加了MA20（金色虚线）和MA60（蓝色点线）两条移动平均线，帮助判断中长期趋势方向。</w:t>
-      </w:r>
-    </w:p>
-    <w:p>
-      <w:pPr>
-        <w:spacing w:after="60" w:line="240" w:lineRule="auto"/>
-        <w:jc w:val="center"/>
-      </w:pPr>
-      <w:r>
-        <w:rPr>
-          <w:noProof/>
-        </w:rPr>
-        <w:lastRenderedPageBreak/>
-        <w:drawing>
-          <wp:inline distT="0" distB="0" distL="0" distR="0" wp14:anchorId="56029424" wp14:editId="3BFA046B">
-            <wp:extent cx="5029200" cy="3224399"/>
-            <wp:effectExtent l="0" t="0" r="0" b="0"/>
-            <wp:docPr id="3" name="Picture 3"/>
-            <wp:cNvGraphicFramePr>
-              <a:graphicFrameLocks xmlns:a="http://schemas.openxmlformats.org/drawingml/2006/main" noChangeAspect="1"/>
-            </wp:cNvGraphicFramePr>
-            <a:graphic xmlns:a="http://schemas.openxmlformats.org/drawingml/2006/main">
-              <a:graphicData uri="http://schemas.openxmlformats.org/drawingml/2006/picture">
-                <pic:pic xmlns:pic="http://schemas.openxmlformats.org/drawingml/2006/picture">
-                  <pic:nvPicPr>
-                    <pic:cNvPr id="0" name="00700_腾讯控股_candle.png"/>
-                    <pic:cNvPicPr/>
-                  </pic:nvPicPr>
-                  <pic:blipFill>
-                    <a:blip r:embed="rId8"/>
-                    <a:stretch>
-                      <a:fillRect/>
-                    </a:stretch>
-                  </pic:blipFill>
-                  <pic:spPr>
-                    <a:xfrm>
-                      <a:off x="0" y="0"/>
-                      <a:ext cx="5029200" cy="3224399"/>
-                    </a:xfrm>
-                    <a:prstGeom prst="rect">
-                      <a:avLst/>
-                    </a:prstGeom>
-                  </pic:spPr>
-                </pic:pic>
-              </a:graphicData>
-            </a:graphic>
-          </wp:inline>
-        </w:drawing>
-      </w:r>
-    </w:p>
-    <w:p>
-      <w:pPr>
-        <w:spacing w:before="60" w:after="120"/>
-        <w:jc w:val="center"/>
-        <w:rPr>
-          <w:lang w:eastAsia="zh-CN"/>
-        </w:rPr>
-      </w:pPr>
-      <w:r>
-        <w:rPr>
-          <w:b/>
-          <w:sz w:val="18"/>
-          <w:lang w:eastAsia="zh-CN"/>
-        </w:rPr>
-        <w:t>图3：腾讯控股（00700.HK）日K线蜡烛图（</w:t>
-      </w:r>
-      <w:proofErr w:type="spellStart"/>
-      <w:r>
-        <w:rPr>
-          <w:b/>
-          <w:sz w:val="18"/>
-          <w:lang w:eastAsia="zh-CN"/>
-        </w:rPr>
-        <w:t>mplfinance</w:t>
-      </w:r>
-      <w:proofErr w:type="spellEnd"/>
-      <w:r>
-        <w:rPr>
-          <w:b/>
-          <w:sz w:val="18"/>
-          <w:lang w:eastAsia="zh-CN"/>
-        </w:rPr>
-        <w:t>绘制，红涨绿跌+成交量）</w:t>
-      </w:r>
-    </w:p>
-    <w:p>
-      <w:pPr>
-        <w:ind w:firstLine="420"/>
-        <w:rPr>
-          <w:lang w:eastAsia="zh-CN"/>
-        </w:rPr>
-      </w:pPr>
-      <w:r>
-        <w:rPr>
-          <w:lang w:eastAsia="zh-CN"/>
-        </w:rPr>
-        <w:t>图3为腾讯控股（00700.HK）的日K线蜡烛图。从图中可以清晰观察到，腾讯控股在此期间呈现宽幅震荡格局，出现了多个明显的波段。在上涨波段中频繁出现长阳线（大红色实体），而在下跌波段中则出现多根长阴线（大绿色实体），K线实体的颜色和大小直观反映了市场多空力量的消长。结合下方成交量来看，部分上涨日伴随了显著放大的成交量，表明资金的积极参与；而在震荡整理阶段，成交量则明显萎缩，反映出市场的观望情绪。</w:t>
-      </w:r>
-    </w:p>
-    <w:p>
-      <w:pPr>
-        <w:spacing w:after="60" w:line="240" w:lineRule="auto"/>
-        <w:jc w:val="center"/>
-      </w:pPr>
-      <w:r>
-        <w:rPr>
-          <w:noProof/>
-        </w:rPr>
-        <w:drawing>
-          <wp:inline distT="0" distB="0" distL="0" distR="0" wp14:anchorId="01884076" wp14:editId="631D9C32">
-            <wp:extent cx="5029200" cy="3236181"/>
-            <wp:effectExtent l="0" t="0" r="0" b="0"/>
-            <wp:docPr id="4" name="Picture 4"/>
-            <wp:cNvGraphicFramePr>
-              <a:graphicFrameLocks xmlns:a="http://schemas.openxmlformats.org/drawingml/2006/main" noChangeAspect="1"/>
-            </wp:cNvGraphicFramePr>
-            <a:graphic xmlns:a="http://schemas.openxmlformats.org/drawingml/2006/main">
-              <a:graphicData uri="http://schemas.openxmlformats.org/drawingml/2006/picture">
-                <pic:pic xmlns:pic="http://schemas.openxmlformats.org/drawingml/2006/picture">
-                  <pic:nvPicPr>
-                    <pic:cNvPr id="0" name="300750_宁德时代_recent_candle.png"/>
-                    <pic:cNvPicPr/>
-                  </pic:nvPicPr>
-                  <pic:blipFill>
-                    <a:blip r:embed="rId9"/>
-                    <a:stretch>
-                      <a:fillRect/>
-                    </a:stretch>
-                  </pic:blipFill>
-                  <pic:spPr>
-                    <a:xfrm>
-                      <a:off x="0" y="0"/>
-                      <a:ext cx="5029200" cy="3236181"/>
-                    </a:xfrm>
-                    <a:prstGeom prst="rect">
-                      <a:avLst/>
-                    </a:prstGeom>
-                  </pic:spPr>
-                </pic:pic>
-              </a:graphicData>
-            </a:graphic>
-          </wp:inline>
-        </w:drawing>
-      </w:r>
-    </w:p>
-    <w:p>
-      <w:pPr>
-        <w:spacing w:before="60" w:after="120"/>
-        <w:jc w:val="center"/>
-        <w:rPr>
-          <w:lang w:eastAsia="zh-CN"/>
-        </w:rPr>
-      </w:pPr>
-      <w:r>
-        <w:rPr>
-          <w:b/>
-          <w:sz w:val="18"/>
-          <w:lang w:eastAsia="zh-CN"/>
-        </w:rPr>
-        <w:t>图4：宁德时代近3个月日K线细节放大图（含MA10/MA30）</w:t>
-      </w:r>
-    </w:p>
-    <w:p>
-      <w:pPr>
-        <w:ind w:firstLine="420"/>
-        <w:rPr>
-          <w:lang w:eastAsia="zh-CN"/>
-        </w:rPr>
-      </w:pPr>
-      <w:r>
-        <w:rPr>
-          <w:lang w:eastAsia="zh-CN"/>
-        </w:rPr>
-        <w:lastRenderedPageBreak/>
-        <w:t>图4将宁德时代近3个月的K线进行放大展示，便于观察短期K线形态的细节。图中叠加了MA10（橙色虚线）和MA30（绿色点线）两条短期均线，比全年图中的MA20/MA60更加灵敏，能够更快地捕捉短期趋势变化。从近期K线形态来看，可以识别出多根十字星（开盘价与收盘价接近，实体极小），反映出市场在关键价位的多空分歧。</w:t>
-      </w:r>
-    </w:p>
-    <w:p>
-      <w:pPr>
         <w:spacing w:before="120" w:after="60"/>
         <w:jc w:val="left"/>
         <w:rPr>
@@ -1198,7 +898,6 @@
       <w:pPr>
         <w:ind w:firstLine="420"/>
         <w:rPr>
-          <w:rFonts w:hint="eastAsia"/>
           <w:lang w:eastAsia="zh-CN"/>
         </w:rPr>
       </w:pPr>
@@ -1280,7 +979,19 @@
         <w:rPr>
           <w:lang w:eastAsia="zh-CN"/>
         </w:rPr>
-        <w:t>至 GitHub 仓库：https://github.com/RebekahLllimx/ai_quant_course_info/tree/main/Task1</w:t>
+        <w:t>至 GitHub 仓库：https://github.com/RebekahLllimx/ai_quant_course_</w:t>
+      </w:r>
+      <w:r>
+        <w:rPr>
+          <w:lang w:eastAsia="zh-CN"/>
+        </w:rPr>
+        <w:t>hw</w:t>
+      </w:r>
+      <w:r>
+        <w:rPr>
+          <w:lang w:eastAsia="zh-CN"/>
+        </w:rPr>
+        <w:t>/tree/main/Task1</w:t>
       </w:r>
     </w:p>
     <w:p>

</xml_diff>